<commit_message>
control meeting verison of the report
</commit_message>
<xml_diff>
--- a/Report/SCS_raport.docx
+++ b/Report/SCS_raport.docx
@@ -342,12 +342,24 @@
     </w:p>
     <w:p>
       <w:pPr>
+        <w:pStyle w:val="Normalny"/>
+        <w:suppressLineNumbers w:val="0"/>
+        <w:bidi w:val="0"/>
+        <w:spacing w:before="0" w:beforeAutospacing="off" w:after="0" w:afterAutospacing="off" w:line="259" w:lineRule="auto"/>
+        <w:ind w:left="0" w:right="0"/>
         <w:jc w:val="center"/>
         <w:rPr>
           <w:rFonts w:ascii="Arial" w:hAnsi="Arial" w:cs="Arial"/>
           <w:lang w:val="en-GB"/>
         </w:rPr>
       </w:pPr>
+      <w:r>
+        <w:rPr>
+          <w:rFonts w:ascii="Arial" w:hAnsi="Arial" w:cs="Arial"/>
+          <w:lang w:val="en-GB"/>
+        </w:rPr>
+        <w:t>Miłosz Gonsior, 193475</w:t>
+      </w:r>
     </w:p>
     <w:p>
       <w:pPr>
@@ -375,6 +387,15 @@
           <w:lang w:val="en-GB"/>
         </w:rPr>
       </w:pPr>
+    </w:p>
+    <w:p>
+      <w:pPr>
+        <w:jc w:val="center"/>
+        <w:rPr>
+          <w:rFonts w:ascii="Arial" w:hAnsi="Arial" w:cs="Arial"/>
+          <w:lang w:val="en-GB"/>
+        </w:rPr>
+      </w:pPr>
       <w:r>
         <w:rPr>
           <w:rFonts w:ascii="Arial" w:hAnsi="Arial" w:cs="Arial"/>
@@ -394,7 +415,14 @@
           <w:rFonts w:ascii="Arial" w:hAnsi="Arial" w:cs="Arial"/>
           <w:lang w:val="en-GB"/>
         </w:rPr>
-        <w:t xml:space="preserve"> 1.0</w:t>
+        <w:t xml:space="preserve"> 1.</w:t>
+      </w:r>
+      <w:r>
+        <w:rPr>
+          <w:rFonts w:ascii="Arial" w:hAnsi="Arial" w:cs="Arial"/>
+          <w:lang w:val="en-GB"/>
+        </w:rPr>
+        <w:t>1</w:t>
       </w:r>
     </w:p>
     <w:p>
@@ -672,7 +700,7 @@
               <w:rPr>
                 <w:lang w:val="en-GB"/>
               </w:rPr>
-              <w:t>…</w:t>
+              <w:t>07.04.2026</w:t>
             </w:r>
           </w:p>
         </w:tc>
@@ -685,6 +713,10 @@
           <w:p>
             <w:pPr>
               <w:pStyle w:val="Spr-tabela-tekst"/>
+              <w:suppressLineNumbers w:val="0"/>
+              <w:bidi w:val="0"/>
+              <w:spacing w:before="60" w:beforeAutospacing="off" w:after="60" w:afterAutospacing="off" w:line="259" w:lineRule="auto"/>
+              <w:ind w:left="0" w:right="0"/>
               <w:jc w:val="center"/>
               <w:rPr>
                 <w:lang w:val="en-GB"/>
@@ -694,7 +726,19 @@
               <w:rPr>
                 <w:lang w:val="en-GB"/>
               </w:rPr>
-              <w:t>…</w:t>
+              <w:t xml:space="preserve">Filling out the </w:t>
+            </w:r>
+            <w:r>
+              <w:rPr>
+                <w:lang w:val="en-GB"/>
+              </w:rPr>
+              <w:t>control</w:t>
+            </w:r>
+            <w:r>
+              <w:rPr>
+                <w:lang w:val="en-GB"/>
+              </w:rPr>
+              <w:t xml:space="preserve"> meeting section</w:t>
             </w:r>
           </w:p>
         </w:tc>
@@ -851,7 +895,183 @@
           <w:rFonts w:ascii="Arial" w:hAnsi="Arial" w:cs="Arial"/>
           <w:lang w:val="en-GB"/>
         </w:rPr>
-        <w:t>Content</w:t>
+        <w:t xml:space="preserve">The aim of the overall project is the </w:t>
+      </w:r>
+      <w:r>
+        <w:rPr>
+          <w:rFonts w:ascii="Arial" w:hAnsi="Arial" w:cs="Arial"/>
+          <w:lang w:val="en-GB"/>
+        </w:rPr>
+        <w:t>implementation of a set of applications emulating an environment with trusted third party</w:t>
+      </w:r>
+      <w:r>
+        <w:rPr>
+          <w:rFonts w:ascii="Arial" w:hAnsi="Arial" w:cs="Arial"/>
+          <w:lang w:val="en-GB"/>
+        </w:rPr>
+        <w:t xml:space="preserve"> (TTP)</w:t>
+      </w:r>
+      <w:r>
+        <w:rPr>
+          <w:rFonts w:ascii="Arial" w:hAnsi="Arial" w:cs="Arial"/>
+          <w:lang w:val="en-GB"/>
+        </w:rPr>
+        <w:t xml:space="preserve">, </w:t>
+      </w:r>
+      <w:r>
+        <w:rPr>
+          <w:rFonts w:ascii="Arial" w:hAnsi="Arial" w:cs="Arial"/>
+          <w:lang w:val="en-GB"/>
+        </w:rPr>
+        <w:t>server</w:t>
+      </w:r>
+      <w:r>
+        <w:rPr>
+          <w:rFonts w:ascii="Arial" w:hAnsi="Arial" w:cs="Arial"/>
+          <w:lang w:val="en-GB"/>
+        </w:rPr>
+        <w:t xml:space="preserve"> and a client.</w:t>
+      </w:r>
+    </w:p>
+    <w:p>
+      <w:pPr>
+        <w:pStyle w:val="Akapitzlist"/>
+        <w:tabs>
+          <w:tab w:val="left" w:pos="567"/>
+        </w:tabs>
+        <w:suppressAutoHyphens/>
+        <w:autoSpaceDN w:val="0"/>
+        <w:spacing w:before="120" w:after="120" w:line="276" w:lineRule="auto"/>
+        <w:ind w:left="405"/>
+        <w:jc w:val="both"/>
+        <w:textAlignment w:val="baseline"/>
+        <w:rPr>
+          <w:rFonts w:ascii="Arial" w:hAnsi="Arial" w:cs="Arial"/>
+          <w:lang w:val="en-GB"/>
+        </w:rPr>
+      </w:pPr>
+    </w:p>
+    <w:p>
+      <w:pPr>
+        <w:pStyle w:val="Akapitzlist"/>
+        <w:numPr>
+          <w:ilvl w:val="1"/>
+          <w:numId w:val="14"/>
+        </w:numPr>
+        <w:tabs>
+          <w:tab w:val="left" w:leader="none" w:pos="567"/>
+        </w:tabs>
+        <w:spacing w:before="120" w:after="120" w:line="276" w:lineRule="auto"/>
+        <w:jc w:val="both"/>
+        <w:rPr>
+          <w:rFonts w:ascii="Arial" w:hAnsi="Arial" w:cs="Arial"/>
+          <w:b w:val="1"/>
+          <w:bCs w:val="1"/>
+          <w:i w:val="1"/>
+          <w:iCs w:val="1"/>
+          <w:lang w:val="en-GB"/>
+        </w:rPr>
+      </w:pPr>
+      <w:r>
+        <w:rPr>
+          <w:rFonts w:ascii="Arial" w:hAnsi="Arial" w:cs="Arial"/>
+          <w:b w:val="1"/>
+          <w:bCs w:val="1"/>
+          <w:i w:val="1"/>
+          <w:iCs w:val="1"/>
+          <w:lang w:val="en-GB"/>
+        </w:rPr>
+        <w:t>Results</w:t>
+      </w:r>
+      <w:r>
+        <w:rPr>
+          <w:rFonts w:ascii="Arial" w:hAnsi="Arial" w:cs="Arial"/>
+          <w:b w:val="1"/>
+          <w:bCs w:val="1"/>
+          <w:i w:val="1"/>
+          <w:iCs w:val="1"/>
+          <w:lang w:val="en-GB"/>
+        </w:rPr>
+        <w:t xml:space="preserve"> – implemented functionalities</w:t>
+      </w:r>
+    </w:p>
+    <w:p>
+      <w:pPr>
+        <w:pStyle w:val="Akapitzlist"/>
+        <w:numPr>
+          <w:ilvl w:val="0"/>
+          <w:numId w:val="29"/>
+        </w:numPr>
+        <w:tabs>
+          <w:tab w:val="left" w:pos="567"/>
+        </w:tabs>
+        <w:suppressAutoHyphens/>
+        <w:autoSpaceDN w:val="0"/>
+        <w:spacing w:before="120" w:after="120" w:line="276" w:lineRule="auto"/>
+        <w:ind/>
+        <w:jc w:val="both"/>
+        <w:textAlignment w:val="baseline"/>
+        <w:rPr>
+          <w:rFonts w:ascii="Arial" w:hAnsi="Arial" w:cs="Arial"/>
+          <w:lang w:val="en-GB"/>
+        </w:rPr>
+      </w:pPr>
+      <w:r>
+        <w:rPr>
+          <w:rFonts w:ascii="Arial" w:hAnsi="Arial" w:cs="Arial"/>
+          <w:lang w:val="en-GB"/>
+        </w:rPr>
+        <w:t>Docker configuration</w:t>
+      </w:r>
+    </w:p>
+    <w:p>
+      <w:pPr>
+        <w:pStyle w:val="Akapitzlist"/>
+        <w:numPr>
+          <w:ilvl w:val="0"/>
+          <w:numId w:val="29"/>
+        </w:numPr>
+        <w:tabs>
+          <w:tab w:val="left" w:pos="567"/>
+        </w:tabs>
+        <w:suppressAutoHyphens/>
+        <w:autoSpaceDN w:val="0"/>
+        <w:spacing w:before="120" w:after="120" w:line="276" w:lineRule="auto"/>
+        <w:ind/>
+        <w:jc w:val="both"/>
+        <w:textAlignment w:val="baseline"/>
+        <w:rPr>
+          <w:rFonts w:ascii="Arial" w:hAnsi="Arial" w:cs="Arial"/>
+          <w:lang w:val="en-GB"/>
+        </w:rPr>
+      </w:pPr>
+      <w:r>
+        <w:rPr>
+          <w:rFonts w:ascii="Arial" w:hAnsi="Arial" w:cs="Arial"/>
+          <w:lang w:val="en-GB"/>
+        </w:rPr>
+        <w:t>B</w:t>
+      </w:r>
+      <w:r>
+        <w:rPr>
+          <w:rFonts w:ascii="Arial" w:hAnsi="Arial" w:cs="Arial"/>
+          <w:lang w:val="en-GB"/>
+        </w:rPr>
+        <w:t>asic version of</w:t>
+      </w:r>
+      <w:r>
+        <w:rPr>
+          <w:rFonts w:ascii="Arial" w:hAnsi="Arial" w:cs="Arial"/>
+          <w:lang w:val="en-GB"/>
+        </w:rPr>
+        <w:t xml:space="preserve"> server and TTP </w:t>
+      </w:r>
+      <w:r>
+        <w:rPr>
+          <w:rFonts w:ascii="Arial" w:hAnsi="Arial" w:cs="Arial"/>
+          <w:lang w:val="en-GB"/>
+        </w:rPr>
+        <w:t>applications</w:t>
       </w:r>
     </w:p>
     <w:p>
@@ -885,217 +1105,36 @@
         <w:suppressAutoHyphens/>
         <w:autoSpaceDN w:val="0"/>
         <w:spacing w:before="120" w:after="120" w:line="276" w:lineRule="auto"/>
+        <w:ind/>
         <w:jc w:val="both"/>
         <w:textAlignment w:val="baseline"/>
         <w:rPr>
           <w:rFonts w:ascii="Arial" w:hAnsi="Arial" w:cs="Arial"/>
-          <w:b/>
-          <w:i/>
-          <w:lang w:val="en-GB"/>
-        </w:rPr>
-      </w:pPr>
-      <w:r>
-        <w:rPr>
-          <w:rFonts w:ascii="Arial" w:hAnsi="Arial" w:cs="Arial"/>
-          <w:b/>
-          <w:i/>
-          <w:lang w:val="en-GB"/>
-        </w:rPr>
-        <w:t>Results</w:t>
-      </w:r>
-    </w:p>
-    <w:p>
-      <w:pPr>
-        <w:pStyle w:val="Akapitzlist"/>
-        <w:tabs>
-          <w:tab w:val="left" w:pos="567"/>
-        </w:tabs>
-        <w:suppressAutoHyphens/>
-        <w:autoSpaceDN w:val="0"/>
-        <w:spacing w:before="120" w:after="120" w:line="276" w:lineRule="auto"/>
-        <w:ind w:left="405"/>
-        <w:jc w:val="both"/>
-        <w:textAlignment w:val="baseline"/>
-        <w:rPr>
-          <w:rFonts w:ascii="Arial" w:hAnsi="Arial" w:cs="Arial"/>
-          <w:lang w:val="en-GB"/>
-        </w:rPr>
-      </w:pPr>
-      <w:r>
-        <w:rPr>
-          <w:rFonts w:ascii="Arial" w:hAnsi="Arial" w:cs="Arial"/>
-          <w:lang w:val="en-GB"/>
-        </w:rPr>
-        <w:t>Content</w:t>
-      </w:r>
-    </w:p>
-    <w:p>
-      <w:pPr>
-        <w:pStyle w:val="Akapitzlist"/>
-        <w:tabs>
-          <w:tab w:val="left" w:pos="567"/>
-        </w:tabs>
-        <w:suppressAutoHyphens/>
-        <w:autoSpaceDN w:val="0"/>
-        <w:spacing w:before="120" w:after="120" w:line="276" w:lineRule="auto"/>
-        <w:ind w:left="360"/>
-        <w:jc w:val="both"/>
-        <w:textAlignment w:val="baseline"/>
-        <w:rPr>
-          <w:rFonts w:ascii="Arial" w:hAnsi="Arial" w:cs="Arial"/>
-          <w:lang w:val="en-GB"/>
-        </w:rPr>
-      </w:pPr>
-      <w:r>
-        <w:rPr>
-          <w:rFonts w:ascii="Arial" w:hAnsi="Arial" w:cs="Arial"/>
-          <w:lang w:val="en-GB"/>
-        </w:rPr>
-        <w:t>Content and content.</w:t>
-      </w:r>
-    </w:p>
-    <w:p>
-      <w:pPr>
-        <w:pStyle w:val="Akapitzlist"/>
-        <w:tabs>
-          <w:tab w:val="left" w:pos="567"/>
-        </w:tabs>
-        <w:suppressAutoHyphens/>
-        <w:autoSpaceDN w:val="0"/>
-        <w:spacing w:before="120" w:after="120" w:line="276" w:lineRule="auto"/>
-        <w:ind w:left="360"/>
-        <w:jc w:val="center"/>
-        <w:textAlignment w:val="baseline"/>
-        <w:rPr>
-          <w:rFonts w:ascii="Arial" w:hAnsi="Arial" w:cs="Arial"/>
-          <w:lang w:val="en-GB"/>
-        </w:rPr>
-      </w:pPr>
-      <w:r>
-        <w:rPr>
-          <w:rFonts w:ascii="Arial" w:hAnsi="Arial" w:cs="Arial"/>
-          <w:noProof/>
-          <w:lang w:val="en-GB"/>
-        </w:rPr>
-        <w:drawing>
-          <wp:inline distT="0" distB="0" distL="0" distR="0" wp14:anchorId="56C406C7" wp14:editId="173CD379">
-            <wp:extent cx="2879002" cy="1156872"/>
-            <wp:effectExtent l="0" t="0" r="4445" b="0"/>
-            <wp:docPr id="1911524315" name="Obraz 1" descr="Obraz zawierający diagram, zrzut ekranu, linia, Prostokąt&#10;&#10;Zawartość wygenerowana przez sztuczną inteligencję może być niepoprawna."/>
-            <wp:cNvGraphicFramePr>
-              <a:graphicFrameLocks xmlns:a="http://schemas.openxmlformats.org/drawingml/2006/main" noChangeAspect="1"/>
-            </wp:cNvGraphicFramePr>
-            <a:graphic xmlns:a="http://schemas.openxmlformats.org/drawingml/2006/main">
-              <a:graphicData uri="http://schemas.openxmlformats.org/drawingml/2006/picture">
-                <pic:pic xmlns:pic="http://schemas.openxmlformats.org/drawingml/2006/picture">
-                  <pic:nvPicPr>
-                    <pic:cNvPr id="1911524315" name="Obraz 1" descr="Obraz zawierający diagram, zrzut ekranu, linia, Prostokąt&#10;&#10;Zawartość wygenerowana przez sztuczną inteligencję może być niepoprawna."/>
-                    <pic:cNvPicPr/>
-                  </pic:nvPicPr>
-                  <pic:blipFill>
-                    <a:blip r:embed="rId8">
-                      <a:extLst>
-                        <a:ext uri="{28A0092B-C50C-407E-A947-70E740481C1C}">
-                          <a14:useLocalDpi xmlns:a14="http://schemas.microsoft.com/office/drawing/2010/main" val="0"/>
-                        </a:ext>
-                      </a:extLst>
-                    </a:blip>
-                    <a:stretch>
-                      <a:fillRect/>
-                    </a:stretch>
-                  </pic:blipFill>
-                  <pic:spPr>
-                    <a:xfrm>
-                      <a:off x="0" y="0"/>
-                      <a:ext cx="2949793" cy="1185318"/>
-                    </a:xfrm>
-                    <a:prstGeom prst="rect">
-                      <a:avLst/>
-                    </a:prstGeom>
-                  </pic:spPr>
-                </pic:pic>
-              </a:graphicData>
-            </a:graphic>
-          </wp:inline>
-        </w:drawing>
-      </w:r>
-    </w:p>
-    <w:p>
-      <w:pPr>
-        <w:tabs>
-          <w:tab w:val="left" w:pos="567"/>
-        </w:tabs>
-        <w:suppressAutoHyphens/>
-        <w:autoSpaceDN w:val="0"/>
-        <w:spacing w:before="120" w:after="120" w:line="276" w:lineRule="auto"/>
-        <w:jc w:val="center"/>
-        <w:textAlignment w:val="baseline"/>
-        <w:rPr>
-          <w:rFonts w:ascii="Arial" w:hAnsi="Arial" w:cs="Arial"/>
-          <w:i/>
-          <w:iCs/>
-          <w:lang w:val="en-GB"/>
-        </w:rPr>
-      </w:pPr>
-      <w:r>
-        <w:rPr>
-          <w:rFonts w:ascii="Arial" w:hAnsi="Arial" w:cs="Arial"/>
-          <w:i/>
-          <w:iCs/>
-          <w:lang w:val="en-GB"/>
-        </w:rPr>
-        <w:t>Fig. 1 – Block diagram.</w:t>
-      </w:r>
-    </w:p>
-    <w:p>
-      <w:pPr>
-        <w:pStyle w:val="Akapitzlist"/>
-        <w:tabs>
-          <w:tab w:val="left" w:pos="567"/>
-        </w:tabs>
-        <w:suppressAutoHyphens/>
-        <w:autoSpaceDN w:val="0"/>
-        <w:spacing w:before="120" w:after="120" w:line="276" w:lineRule="auto"/>
-        <w:ind w:left="405"/>
-        <w:jc w:val="both"/>
-        <w:textAlignment w:val="baseline"/>
-        <w:rPr>
-          <w:rFonts w:ascii="Arial" w:hAnsi="Arial" w:cs="Arial"/>
-          <w:lang w:val="en-GB"/>
-        </w:rPr>
-      </w:pPr>
-      <w:r>
-        <w:rPr>
-          <w:rFonts w:ascii="Arial" w:hAnsi="Arial" w:cs="Arial"/>
-          <w:lang w:val="en-GB"/>
-        </w:rPr>
-        <w:t>Final content.</w:t>
-      </w:r>
-    </w:p>
-    <w:p>
-      <w:pPr>
-        <w:pStyle w:val="Akapitzlist"/>
-        <w:tabs>
-          <w:tab w:val="left" w:pos="567"/>
-        </w:tabs>
-        <w:suppressAutoHyphens/>
-        <w:autoSpaceDN w:val="0"/>
-        <w:spacing w:before="120" w:after="120" w:line="276" w:lineRule="auto"/>
-        <w:ind w:left="405"/>
-        <w:jc w:val="both"/>
-        <w:textAlignment w:val="baseline"/>
-        <w:rPr>
-          <w:rFonts w:ascii="Arial" w:hAnsi="Arial" w:cs="Arial"/>
-          <w:lang w:val="en-GB"/>
-        </w:rPr>
-      </w:pPr>
+          <w:b w:val="1"/>
+          <w:bCs w:val="1"/>
+          <w:i w:val="1"/>
+          <w:iCs w:val="1"/>
+          <w:lang w:val="en-GB"/>
+        </w:rPr>
+      </w:pPr>
+      <w:r>
+        <w:rPr>
+          <w:rFonts w:ascii="Arial" w:hAnsi="Arial" w:cs="Arial"/>
+          <w:b w:val="1"/>
+          <w:bCs w:val="1"/>
+          <w:i w:val="1"/>
+          <w:iCs w:val="1"/>
+          <w:lang w:val="en-GB"/>
+        </w:rPr>
+        <w:t>Plans for future work</w:t>
+      </w:r>
     </w:p>
     <w:p>
       <w:pPr>
         <w:pStyle w:val="Akapitzlist"/>
         <w:numPr>
-          <w:ilvl w:val="1"/>
-          <w:numId w:val="14"/>
+          <w:ilvl w:val="0"/>
+          <w:numId w:val="26"/>
         </w:numPr>
         <w:tabs>
           <w:tab w:val="left" w:pos="567"/>
@@ -1103,35 +1142,36 @@
         <w:suppressAutoHyphens/>
         <w:autoSpaceDN w:val="0"/>
         <w:spacing w:before="120" w:after="120" w:line="276" w:lineRule="auto"/>
+        <w:ind/>
         <w:jc w:val="both"/>
         <w:textAlignment w:val="baseline"/>
         <w:rPr>
           <w:rFonts w:ascii="Arial" w:hAnsi="Arial" w:cs="Arial"/>
-          <w:b/>
-          <w:i/>
-          <w:lang w:val="en-GB"/>
-        </w:rPr>
-      </w:pPr>
-      <w:r>
-        <w:rPr>
-          <w:rFonts w:ascii="Arial" w:hAnsi="Arial" w:cs="Arial"/>
-          <w:b/>
-          <w:i/>
-          <w:lang w:val="en-GB"/>
-        </w:rPr>
-        <w:t>Summary</w:t>
+          <w:lang w:val="en-GB"/>
+        </w:rPr>
+      </w:pPr>
+      <w:r>
+        <w:rPr>
+          <w:rFonts w:ascii="Arial" w:hAnsi="Arial" w:cs="Arial"/>
+          <w:lang w:val="en-GB"/>
+        </w:rPr>
+        <w:t>Design and implementation of a Graphical User Interface (GUI)</w:t>
       </w:r>
     </w:p>
     <w:p>
       <w:pPr>
         <w:pStyle w:val="Akapitzlist"/>
+        <w:numPr>
+          <w:ilvl w:val="1"/>
+          <w:numId w:val="26"/>
+        </w:numPr>
         <w:tabs>
           <w:tab w:val="left" w:pos="567"/>
         </w:tabs>
         <w:suppressAutoHyphens/>
         <w:autoSpaceDN w:val="0"/>
         <w:spacing w:before="120" w:after="120" w:line="276" w:lineRule="auto"/>
-        <w:ind w:left="405"/>
+        <w:ind/>
         <w:jc w:val="both"/>
         <w:textAlignment w:val="baseline"/>
         <w:rPr>
@@ -1144,7 +1184,137 @@
           <w:rFonts w:ascii="Arial" w:hAnsi="Arial" w:cs="Arial"/>
           <w:lang w:val="en-GB"/>
         </w:rPr>
-        <w:t>Content</w:t>
+        <w:t>Icons presenting the state of the application</w:t>
+      </w:r>
+    </w:p>
+    <w:p>
+      <w:pPr>
+        <w:pStyle w:val="Akapitzlist"/>
+        <w:numPr>
+          <w:ilvl w:val="0"/>
+          <w:numId w:val="26"/>
+        </w:numPr>
+        <w:tabs>
+          <w:tab w:val="left" w:pos="567"/>
+        </w:tabs>
+        <w:suppressAutoHyphens/>
+        <w:autoSpaceDN w:val="0"/>
+        <w:spacing w:before="120" w:after="120" w:line="276" w:lineRule="auto"/>
+        <w:ind/>
+        <w:jc w:val="both"/>
+        <w:textAlignment w:val="baseline"/>
+        <w:rPr>
+          <w:rFonts w:ascii="Arial" w:hAnsi="Arial" w:cs="Arial"/>
+          <w:lang w:val="en-GB"/>
+        </w:rPr>
+      </w:pPr>
+      <w:r>
+        <w:rPr>
+          <w:rFonts w:ascii="Arial" w:hAnsi="Arial" w:cs="Arial"/>
+          <w:lang w:val="en-GB"/>
+        </w:rPr>
+        <w:t>Implementation of the Client</w:t>
+      </w:r>
+    </w:p>
+    <w:p>
+      <w:pPr>
+        <w:pStyle w:val="Akapitzlist"/>
+        <w:numPr>
+          <w:ilvl w:val="0"/>
+          <w:numId w:val="26"/>
+        </w:numPr>
+        <w:tabs>
+          <w:tab w:val="left" w:pos="567"/>
+        </w:tabs>
+        <w:suppressAutoHyphens/>
+        <w:autoSpaceDN w:val="0"/>
+        <w:spacing w:before="120" w:after="120" w:line="276" w:lineRule="auto"/>
+        <w:ind/>
+        <w:jc w:val="both"/>
+        <w:textAlignment w:val="baseline"/>
+        <w:rPr>
+          <w:rFonts w:ascii="Arial" w:hAnsi="Arial" w:cs="Arial"/>
+          <w:lang w:val="en-GB"/>
+        </w:rPr>
+      </w:pPr>
+      <w:r>
+        <w:rPr>
+          <w:rFonts w:ascii="Arial" w:hAnsi="Arial" w:cs="Arial"/>
+          <w:lang w:val="en-GB"/>
+        </w:rPr>
+        <w:t>Running tests (</w:t>
+      </w:r>
+      <w:r>
+        <w:rPr>
+          <w:rFonts w:ascii="Arial" w:hAnsi="Arial" w:cs="Arial"/>
+          <w:lang w:val="en-GB"/>
+        </w:rPr>
+        <w:t>eg. s</w:t>
+      </w:r>
+      <w:r>
+        <w:rPr>
+          <w:rFonts w:ascii="Arial" w:hAnsi="Arial" w:cs="Arial"/>
+          <w:lang w:val="en-GB"/>
+        </w:rPr>
+        <w:t>ample attacks)</w:t>
+      </w:r>
+    </w:p>
+    <w:p>
+      <w:pPr>
+        <w:pStyle w:val="Akapitzlist"/>
+        <w:numPr>
+          <w:ilvl w:val="0"/>
+          <w:numId w:val="26"/>
+        </w:numPr>
+        <w:tabs>
+          <w:tab w:val="left" w:pos="567"/>
+        </w:tabs>
+        <w:suppressAutoHyphens/>
+        <w:autoSpaceDN w:val="0"/>
+        <w:spacing w:before="120" w:after="120" w:line="276" w:lineRule="auto"/>
+        <w:ind/>
+        <w:jc w:val="both"/>
+        <w:textAlignment w:val="baseline"/>
+        <w:rPr>
+          <w:rFonts w:ascii="Arial" w:hAnsi="Arial" w:cs="Arial"/>
+          <w:lang w:val="en-GB"/>
+        </w:rPr>
+      </w:pPr>
+      <w:r>
+        <w:rPr>
+          <w:rFonts w:ascii="Arial" w:hAnsi="Arial" w:cs="Arial"/>
+          <w:lang w:val="en-GB"/>
+        </w:rPr>
+        <w:t>Generation of documentation using Doxygen</w:t>
+      </w:r>
+    </w:p>
+    <w:p>
+      <w:pPr>
+        <w:pStyle w:val="Akapitzlist"/>
+        <w:numPr>
+          <w:ilvl w:val="0"/>
+          <w:numId w:val="26"/>
+        </w:numPr>
+        <w:tabs>
+          <w:tab w:val="left" w:pos="567"/>
+        </w:tabs>
+        <w:suppressAutoHyphens/>
+        <w:autoSpaceDN w:val="0"/>
+        <w:spacing w:before="120" w:after="120" w:line="276" w:lineRule="auto"/>
+        <w:ind/>
+        <w:jc w:val="both"/>
+        <w:textAlignment w:val="baseline"/>
+        <w:rPr>
+          <w:rFonts w:ascii="Arial" w:hAnsi="Arial" w:cs="Arial"/>
+          <w:lang w:val="en-GB"/>
+        </w:rPr>
+      </w:pPr>
+      <w:r>
+        <w:rPr>
+          <w:rFonts w:ascii="Arial" w:hAnsi="Arial" w:cs="Arial"/>
+          <w:lang w:val="en-GB"/>
+        </w:rPr>
+        <w:t>Generating the session keys</w:t>
       </w:r>
     </w:p>
     <w:p>
@@ -2201,10 +2371,6 @@
         <w:t>[1]</w:t>
       </w:r>
       <w:r>
-        <w:rPr>
-          <w:rFonts w:ascii="Arial" w:hAnsi="Arial" w:cs="Arial"/>
-          <w:lang w:val="en-GB"/>
-        </w:rPr>
         <w:tab/>
       </w:r>
       <w:r>
@@ -2212,14 +2378,7 @@
           <w:rFonts w:ascii="Arial" w:hAnsi="Arial" w:cs="Arial"/>
           <w:lang w:val="en-GB"/>
         </w:rPr>
-        <w:t>Article</w:t>
-      </w:r>
-      <w:r>
-        <w:rPr>
-          <w:rFonts w:ascii="Arial" w:hAnsi="Arial" w:cs="Arial"/>
-          <w:lang w:val="en-GB"/>
-        </w:rPr>
-        <w:t>.</w:t>
+        <w:t>(project instruction – cite proprely!!)</w:t>
       </w:r>
     </w:p>
     <w:p>
@@ -2519,6 +2678,515 @@
 
 <file path=word/numbering.xml><?xml version="1.0" encoding="utf-8"?>
 <w:numbering xmlns:wpc="http://schemas.microsoft.com/office/word/2010/wordprocessingCanvas" xmlns:cx="http://schemas.microsoft.com/office/drawing/2014/chartex" xmlns:cx1="http://schemas.microsoft.com/office/drawing/2015/9/8/chartex" xmlns:cx2="http://schemas.microsoft.com/office/drawing/2015/10/21/chartex" xmlns:cx3="http://schemas.microsoft.com/office/drawing/2016/5/9/chartex" xmlns:cx4="http://schemas.microsoft.com/office/drawing/2016/5/10/chartex" xmlns:cx5="http://schemas.microsoft.com/office/drawing/2016/5/11/chartex" xmlns:cx6="http://schemas.microsoft.com/office/drawing/2016/5/12/chartex" xmlns:cx7="http://schemas.microsoft.com/office/drawing/2016/5/13/chartex" xmlns:cx8="http://schemas.microsoft.com/office/drawing/2016/5/14/chartex" xmlns:mc="http://schemas.openxmlformats.org/markup-compatibility/2006" xmlns:aink="http://schemas.microsoft.com/office/drawing/2016/ink" xmlns:am3d="http://schemas.microsoft.com/office/drawing/2017/model3d" xmlns:o="urn:schemas-microsoft-com:office:office" xmlns:oel="http://schemas.microsoft.com/office/2019/extlst" xmlns:r="http://schemas.openxmlformats.org/officeDocument/2006/relationships" xmlns:m="http://schemas.openxmlformats.org/officeDocument/2006/math" xmlns:v="urn:schemas-microsoft-com:vml" xmlns:wp14="http://schemas.microsoft.com/office/word/2010/wordprocessingDrawing" xmlns:wp="http://schemas.openxmlformats.org/drawingml/2006/wordprocessingDrawing" xmlns:w10="urn:schemas-microsoft-com:office:word" xmlns:w="http://schemas.openxmlformats.org/wordprocessingml/2006/main" xmlns:w14="http://schemas.microsoft.com/office/word/2010/wordml" xmlns:w15="http://schemas.microsoft.com/office/word/2012/wordml" xmlns:w16cex="http://schemas.microsoft.com/office/word/2018/wordml/cex" xmlns:w16cid="http://schemas.microsoft.com/office/word/2016/wordml/cid" xmlns:w16="http://schemas.microsoft.com/office/word/2018/wordml" xmlns:w16du="http://schemas.microsoft.com/office/word/2023/wordml/word16du" xmlns:w16sdtdh="http://schemas.microsoft.com/office/word/2020/wordml/sdtdatahash" xmlns:w16sdtfl="http://schemas.microsoft.com/office/word/2024/wordml/sdtformatlock" xmlns:w16se="http://schemas.microsoft.com/office/word/2015/wordml/symex" xmlns:wpg="http://schemas.microsoft.com/office/word/2010/wordprocessingGroup" xmlns:wpi="http://schemas.microsoft.com/office/word/2010/wordprocessingInk" xmlns:wne="http://schemas.microsoft.com/office/word/2006/wordml" xmlns:wps="http://schemas.microsoft.com/office/word/2010/wordprocessingShape" mc:Ignorable="w14 w15 w16se w16cid w16 w16cex w16sdtdh w16sdtfl w16du wp14">
+  <w:abstractNum xmlns:w="http://schemas.openxmlformats.org/wordprocessingml/2006/main" w:abstractNumId="23">
+    <w:nsid w:val="243410e1"/>
+    <w:multiLevelType xmlns:w="http://schemas.openxmlformats.org/wordprocessingml/2006/main" w:val="hybridMultilevel"/>
+    <w:lvl xmlns:w="http://schemas.openxmlformats.org/wordprocessingml/2006/main" w:ilvl="0">
+      <w:start w:val="1"/>
+      <w:numFmt w:val="bullet"/>
+      <w:lvlText w:val=""/>
+      <w:lvlJc w:val="left"/>
+      <w:pPr>
+        <w:ind w:left="765" w:hanging="360"/>
+      </w:pPr>
+      <w:rPr>
+        <w:rFonts w:hint="default" w:ascii="Symbol" w:hAnsi="Symbol"/>
+      </w:rPr>
+    </w:lvl>
+    <w:lvl xmlns:w="http://schemas.openxmlformats.org/wordprocessingml/2006/main" w:ilvl="1">
+      <w:start w:val="1"/>
+      <w:numFmt w:val="bullet"/>
+      <w:lvlText w:val="o"/>
+      <w:lvlJc w:val="left"/>
+      <w:pPr>
+        <w:ind w:left="1485" w:hanging="360"/>
+      </w:pPr>
+      <w:rPr>
+        <w:rFonts w:hint="default" w:ascii="Courier New" w:hAnsi="Courier New"/>
+      </w:rPr>
+    </w:lvl>
+    <w:lvl xmlns:w="http://schemas.openxmlformats.org/wordprocessingml/2006/main" w:ilvl="2">
+      <w:start w:val="1"/>
+      <w:numFmt w:val="bullet"/>
+      <w:lvlText w:val=""/>
+      <w:lvlJc w:val="left"/>
+      <w:pPr>
+        <w:ind w:left="2205" w:hanging="360"/>
+      </w:pPr>
+      <w:rPr>
+        <w:rFonts w:hint="default" w:ascii="Wingdings" w:hAnsi="Wingdings"/>
+      </w:rPr>
+    </w:lvl>
+    <w:lvl xmlns:w="http://schemas.openxmlformats.org/wordprocessingml/2006/main" w:ilvl="3">
+      <w:start w:val="1"/>
+      <w:numFmt w:val="bullet"/>
+      <w:lvlText w:val=""/>
+      <w:lvlJc w:val="left"/>
+      <w:pPr>
+        <w:ind w:left="2925" w:hanging="360"/>
+      </w:pPr>
+      <w:rPr>
+        <w:rFonts w:hint="default" w:ascii="Symbol" w:hAnsi="Symbol"/>
+      </w:rPr>
+    </w:lvl>
+    <w:lvl xmlns:w="http://schemas.openxmlformats.org/wordprocessingml/2006/main" w:ilvl="4">
+      <w:start w:val="1"/>
+      <w:numFmt w:val="bullet"/>
+      <w:lvlText w:val="o"/>
+      <w:lvlJc w:val="left"/>
+      <w:pPr>
+        <w:ind w:left="3645" w:hanging="360"/>
+      </w:pPr>
+      <w:rPr>
+        <w:rFonts w:hint="default" w:ascii="Courier New" w:hAnsi="Courier New"/>
+      </w:rPr>
+    </w:lvl>
+    <w:lvl xmlns:w="http://schemas.openxmlformats.org/wordprocessingml/2006/main" w:ilvl="5">
+      <w:start w:val="1"/>
+      <w:numFmt w:val="bullet"/>
+      <w:lvlText w:val=""/>
+      <w:lvlJc w:val="left"/>
+      <w:pPr>
+        <w:ind w:left="4365" w:hanging="360"/>
+      </w:pPr>
+      <w:rPr>
+        <w:rFonts w:hint="default" w:ascii="Wingdings" w:hAnsi="Wingdings"/>
+      </w:rPr>
+    </w:lvl>
+    <w:lvl xmlns:w="http://schemas.openxmlformats.org/wordprocessingml/2006/main" w:ilvl="6">
+      <w:start w:val="1"/>
+      <w:numFmt w:val="bullet"/>
+      <w:lvlText w:val=""/>
+      <w:lvlJc w:val="left"/>
+      <w:pPr>
+        <w:ind w:left="5085" w:hanging="360"/>
+      </w:pPr>
+      <w:rPr>
+        <w:rFonts w:hint="default" w:ascii="Symbol" w:hAnsi="Symbol"/>
+      </w:rPr>
+    </w:lvl>
+    <w:lvl xmlns:w="http://schemas.openxmlformats.org/wordprocessingml/2006/main" w:ilvl="7">
+      <w:start w:val="1"/>
+      <w:numFmt w:val="bullet"/>
+      <w:lvlText w:val="o"/>
+      <w:lvlJc w:val="left"/>
+      <w:pPr>
+        <w:ind w:left="5805" w:hanging="360"/>
+      </w:pPr>
+      <w:rPr>
+        <w:rFonts w:hint="default" w:ascii="Courier New" w:hAnsi="Courier New"/>
+      </w:rPr>
+    </w:lvl>
+    <w:lvl xmlns:w="http://schemas.openxmlformats.org/wordprocessingml/2006/main" w:ilvl="8">
+      <w:start w:val="1"/>
+      <w:numFmt w:val="bullet"/>
+      <w:lvlText w:val=""/>
+      <w:lvlJc w:val="left"/>
+      <w:pPr>
+        <w:ind w:left="6525" w:hanging="360"/>
+      </w:pPr>
+      <w:rPr>
+        <w:rFonts w:hint="default" w:ascii="Wingdings" w:hAnsi="Wingdings"/>
+      </w:rPr>
+    </w:lvl>
+  </w:abstractNum>
+  <w:abstractNum xmlns:w="http://schemas.openxmlformats.org/wordprocessingml/2006/main" w:abstractNumId="22">
+    <w:nsid w:val="49b04809"/>
+    <w:multiLevelType xmlns:w="http://schemas.openxmlformats.org/wordprocessingml/2006/main" w:val="multilevel"/>
+    <w:lvl xmlns:w="http://schemas.openxmlformats.org/wordprocessingml/2006/main" w:ilvl="0">
+      <w:start w:val="1"/>
+      <w:numFmt w:val="decimal"/>
+      <w:lvlText w:val="%1."/>
+      <w:lvlJc w:val="left"/>
+      <w:pPr>
+        <w:ind w:left="405" w:hanging="405"/>
+      </w:pPr>
+      <w:rPr>
+        <w:rFonts w:hint="default" w:ascii="Arial" w:hAnsi="Arial"/>
+      </w:rPr>
+    </w:lvl>
+    <w:lvl xmlns:w="http://schemas.openxmlformats.org/wordprocessingml/2006/main" w:ilvl="1">
+      <w:start w:val="1"/>
+      <w:numFmt w:val="lowerLetter"/>
+      <w:lvlText w:val="%2."/>
+      <w:lvlJc w:val="left"/>
+      <w:pPr>
+        <w:ind w:left="1485" w:hanging="360"/>
+      </w:pPr>
+    </w:lvl>
+    <w:lvl xmlns:w="http://schemas.openxmlformats.org/wordprocessingml/2006/main" w:ilvl="2">
+      <w:start w:val="1"/>
+      <w:numFmt w:val="lowerRoman"/>
+      <w:lvlText w:val="%3."/>
+      <w:lvlJc w:val="right"/>
+      <w:pPr>
+        <w:ind w:left="2205" w:hanging="180"/>
+      </w:pPr>
+    </w:lvl>
+    <w:lvl xmlns:w="http://schemas.openxmlformats.org/wordprocessingml/2006/main" w:ilvl="3">
+      <w:start w:val="1"/>
+      <w:numFmt w:val="decimal"/>
+      <w:lvlText w:val="%4."/>
+      <w:lvlJc w:val="left"/>
+      <w:pPr>
+        <w:ind w:left="2925" w:hanging="360"/>
+      </w:pPr>
+    </w:lvl>
+    <w:lvl xmlns:w="http://schemas.openxmlformats.org/wordprocessingml/2006/main" w:ilvl="4">
+      <w:start w:val="1"/>
+      <w:numFmt w:val="lowerLetter"/>
+      <w:lvlText w:val="%5."/>
+      <w:lvlJc w:val="left"/>
+      <w:pPr>
+        <w:ind w:left="3645" w:hanging="360"/>
+      </w:pPr>
+    </w:lvl>
+    <w:lvl xmlns:w="http://schemas.openxmlformats.org/wordprocessingml/2006/main" w:ilvl="5">
+      <w:start w:val="1"/>
+      <w:numFmt w:val="lowerRoman"/>
+      <w:lvlText w:val="%6."/>
+      <w:lvlJc w:val="right"/>
+      <w:pPr>
+        <w:ind w:left="4365" w:hanging="180"/>
+      </w:pPr>
+    </w:lvl>
+    <w:lvl xmlns:w="http://schemas.openxmlformats.org/wordprocessingml/2006/main" w:ilvl="6">
+      <w:start w:val="1"/>
+      <w:numFmt w:val="decimal"/>
+      <w:lvlText w:val="%7."/>
+      <w:lvlJc w:val="left"/>
+      <w:pPr>
+        <w:ind w:left="5085" w:hanging="360"/>
+      </w:pPr>
+    </w:lvl>
+    <w:lvl xmlns:w="http://schemas.openxmlformats.org/wordprocessingml/2006/main" w:ilvl="7">
+      <w:start w:val="1"/>
+      <w:numFmt w:val="lowerLetter"/>
+      <w:lvlText w:val="%8."/>
+      <w:lvlJc w:val="left"/>
+      <w:pPr>
+        <w:ind w:left="5805" w:hanging="360"/>
+      </w:pPr>
+    </w:lvl>
+    <w:lvl xmlns:w="http://schemas.openxmlformats.org/wordprocessingml/2006/main" w:ilvl="8">
+      <w:start w:val="1"/>
+      <w:numFmt w:val="lowerRoman"/>
+      <w:lvlText w:val="%9."/>
+      <w:lvlJc w:val="right"/>
+      <w:pPr>
+        <w:ind w:left="6525" w:hanging="180"/>
+      </w:pPr>
+    </w:lvl>
+  </w:abstractNum>
+  <w:abstractNum xmlns:w="http://schemas.openxmlformats.org/wordprocessingml/2006/main" w:abstractNumId="21">
+    <w:nsid w:val="18b11b44"/>
+    <w:multiLevelType xmlns:w="http://schemas.openxmlformats.org/wordprocessingml/2006/main" w:val="hybridMultilevel"/>
+    <w:lvl xmlns:w="http://schemas.openxmlformats.org/wordprocessingml/2006/main" w:ilvl="0">
+      <w:start w:val="1"/>
+      <w:numFmt w:val="bullet"/>
+      <w:lvlText w:val=""/>
+      <w:lvlJc w:val="left"/>
+      <w:pPr>
+        <w:ind w:left="765" w:hanging="360"/>
+      </w:pPr>
+      <w:rPr>
+        <w:rFonts w:hint="default" w:ascii="Symbol" w:hAnsi="Symbol"/>
+      </w:rPr>
+    </w:lvl>
+    <w:lvl xmlns:w="http://schemas.openxmlformats.org/wordprocessingml/2006/main" w:ilvl="1">
+      <w:start w:val="1"/>
+      <w:numFmt w:val="bullet"/>
+      <w:lvlText w:val="o"/>
+      <w:lvlJc w:val="left"/>
+      <w:pPr>
+        <w:ind w:left="1485" w:hanging="360"/>
+      </w:pPr>
+      <w:rPr>
+        <w:rFonts w:hint="default" w:ascii="Courier New" w:hAnsi="Courier New"/>
+      </w:rPr>
+    </w:lvl>
+    <w:lvl xmlns:w="http://schemas.openxmlformats.org/wordprocessingml/2006/main" w:ilvl="2">
+      <w:start w:val="1"/>
+      <w:numFmt w:val="bullet"/>
+      <w:lvlText w:val=""/>
+      <w:lvlJc w:val="left"/>
+      <w:pPr>
+        <w:ind w:left="2205" w:hanging="360"/>
+      </w:pPr>
+      <w:rPr>
+        <w:rFonts w:hint="default" w:ascii="Wingdings" w:hAnsi="Wingdings"/>
+      </w:rPr>
+    </w:lvl>
+    <w:lvl xmlns:w="http://schemas.openxmlformats.org/wordprocessingml/2006/main" w:ilvl="3">
+      <w:start w:val="1"/>
+      <w:numFmt w:val="bullet"/>
+      <w:lvlText w:val=""/>
+      <w:lvlJc w:val="left"/>
+      <w:pPr>
+        <w:ind w:left="2925" w:hanging="360"/>
+      </w:pPr>
+      <w:rPr>
+        <w:rFonts w:hint="default" w:ascii="Symbol" w:hAnsi="Symbol"/>
+      </w:rPr>
+    </w:lvl>
+    <w:lvl xmlns:w="http://schemas.openxmlformats.org/wordprocessingml/2006/main" w:ilvl="4">
+      <w:start w:val="1"/>
+      <w:numFmt w:val="bullet"/>
+      <w:lvlText w:val="o"/>
+      <w:lvlJc w:val="left"/>
+      <w:pPr>
+        <w:ind w:left="3645" w:hanging="360"/>
+      </w:pPr>
+      <w:rPr>
+        <w:rFonts w:hint="default" w:ascii="Courier New" w:hAnsi="Courier New"/>
+      </w:rPr>
+    </w:lvl>
+    <w:lvl xmlns:w="http://schemas.openxmlformats.org/wordprocessingml/2006/main" w:ilvl="5">
+      <w:start w:val="1"/>
+      <w:numFmt w:val="bullet"/>
+      <w:lvlText w:val=""/>
+      <w:lvlJc w:val="left"/>
+      <w:pPr>
+        <w:ind w:left="4365" w:hanging="360"/>
+      </w:pPr>
+      <w:rPr>
+        <w:rFonts w:hint="default" w:ascii="Wingdings" w:hAnsi="Wingdings"/>
+      </w:rPr>
+    </w:lvl>
+    <w:lvl xmlns:w="http://schemas.openxmlformats.org/wordprocessingml/2006/main" w:ilvl="6">
+      <w:start w:val="1"/>
+      <w:numFmt w:val="bullet"/>
+      <w:lvlText w:val=""/>
+      <w:lvlJc w:val="left"/>
+      <w:pPr>
+        <w:ind w:left="5085" w:hanging="360"/>
+      </w:pPr>
+      <w:rPr>
+        <w:rFonts w:hint="default" w:ascii="Symbol" w:hAnsi="Symbol"/>
+      </w:rPr>
+    </w:lvl>
+    <w:lvl xmlns:w="http://schemas.openxmlformats.org/wordprocessingml/2006/main" w:ilvl="7">
+      <w:start w:val="1"/>
+      <w:numFmt w:val="bullet"/>
+      <w:lvlText w:val="o"/>
+      <w:lvlJc w:val="left"/>
+      <w:pPr>
+        <w:ind w:left="5805" w:hanging="360"/>
+      </w:pPr>
+      <w:rPr>
+        <w:rFonts w:hint="default" w:ascii="Courier New" w:hAnsi="Courier New"/>
+      </w:rPr>
+    </w:lvl>
+    <w:lvl xmlns:w="http://schemas.openxmlformats.org/wordprocessingml/2006/main" w:ilvl="8">
+      <w:start w:val="1"/>
+      <w:numFmt w:val="bullet"/>
+      <w:lvlText w:val=""/>
+      <w:lvlJc w:val="left"/>
+      <w:pPr>
+        <w:ind w:left="6525" w:hanging="360"/>
+      </w:pPr>
+      <w:rPr>
+        <w:rFonts w:hint="default" w:ascii="Wingdings" w:hAnsi="Wingdings"/>
+      </w:rPr>
+    </w:lvl>
+  </w:abstractNum>
+  <w:abstractNum xmlns:w="http://schemas.openxmlformats.org/wordprocessingml/2006/main" w:abstractNumId="20">
+    <w:nsid w:val="6cca73d0"/>
+    <w:multiLevelType xmlns:w="http://schemas.openxmlformats.org/wordprocessingml/2006/main" w:val="hybridMultilevel"/>
+    <w:lvl xmlns:w="http://schemas.openxmlformats.org/wordprocessingml/2006/main" w:ilvl="0">
+      <w:start w:val="1"/>
+      <w:numFmt w:val="bullet"/>
+      <w:lvlText w:val=""/>
+      <w:lvlJc w:val="left"/>
+      <w:pPr>
+        <w:ind w:left="720" w:hanging="360"/>
+      </w:pPr>
+      <w:rPr>
+        <w:rFonts w:hint="default" w:ascii="Symbol" w:hAnsi="Symbol"/>
+      </w:rPr>
+    </w:lvl>
+    <w:lvl xmlns:w="http://schemas.openxmlformats.org/wordprocessingml/2006/main" w:ilvl="1">
+      <w:start w:val="1"/>
+      <w:numFmt w:val="bullet"/>
+      <w:lvlText w:val="o"/>
+      <w:lvlJc w:val="left"/>
+      <w:pPr>
+        <w:ind w:left="1440" w:hanging="360"/>
+      </w:pPr>
+      <w:rPr>
+        <w:rFonts w:hint="default" w:ascii="Courier New" w:hAnsi="Courier New"/>
+      </w:rPr>
+    </w:lvl>
+    <w:lvl xmlns:w="http://schemas.openxmlformats.org/wordprocessingml/2006/main" w:ilvl="2">
+      <w:start w:val="1"/>
+      <w:numFmt w:val="bullet"/>
+      <w:lvlText w:val=""/>
+      <w:lvlJc w:val="left"/>
+      <w:pPr>
+        <w:ind w:left="2160" w:hanging="360"/>
+      </w:pPr>
+      <w:rPr>
+        <w:rFonts w:hint="default" w:ascii="Wingdings" w:hAnsi="Wingdings"/>
+      </w:rPr>
+    </w:lvl>
+    <w:lvl xmlns:w="http://schemas.openxmlformats.org/wordprocessingml/2006/main" w:ilvl="3">
+      <w:start w:val="1"/>
+      <w:numFmt w:val="bullet"/>
+      <w:lvlText w:val=""/>
+      <w:lvlJc w:val="left"/>
+      <w:pPr>
+        <w:ind w:left="2880" w:hanging="360"/>
+      </w:pPr>
+      <w:rPr>
+        <w:rFonts w:hint="default" w:ascii="Symbol" w:hAnsi="Symbol"/>
+      </w:rPr>
+    </w:lvl>
+    <w:lvl xmlns:w="http://schemas.openxmlformats.org/wordprocessingml/2006/main" w:ilvl="4">
+      <w:start w:val="1"/>
+      <w:numFmt w:val="bullet"/>
+      <w:lvlText w:val="o"/>
+      <w:lvlJc w:val="left"/>
+      <w:pPr>
+        <w:ind w:left="3600" w:hanging="360"/>
+      </w:pPr>
+      <w:rPr>
+        <w:rFonts w:hint="default" w:ascii="Courier New" w:hAnsi="Courier New"/>
+      </w:rPr>
+    </w:lvl>
+    <w:lvl xmlns:w="http://schemas.openxmlformats.org/wordprocessingml/2006/main" w:ilvl="5">
+      <w:start w:val="1"/>
+      <w:numFmt w:val="bullet"/>
+      <w:lvlText w:val=""/>
+      <w:lvlJc w:val="left"/>
+      <w:pPr>
+        <w:ind w:left="4320" w:hanging="360"/>
+      </w:pPr>
+      <w:rPr>
+        <w:rFonts w:hint="default" w:ascii="Wingdings" w:hAnsi="Wingdings"/>
+      </w:rPr>
+    </w:lvl>
+    <w:lvl xmlns:w="http://schemas.openxmlformats.org/wordprocessingml/2006/main" w:ilvl="6">
+      <w:start w:val="1"/>
+      <w:numFmt w:val="bullet"/>
+      <w:lvlText w:val=""/>
+      <w:lvlJc w:val="left"/>
+      <w:pPr>
+        <w:ind w:left="5040" w:hanging="360"/>
+      </w:pPr>
+      <w:rPr>
+        <w:rFonts w:hint="default" w:ascii="Symbol" w:hAnsi="Symbol"/>
+      </w:rPr>
+    </w:lvl>
+    <w:lvl xmlns:w="http://schemas.openxmlformats.org/wordprocessingml/2006/main" w:ilvl="7">
+      <w:start w:val="1"/>
+      <w:numFmt w:val="bullet"/>
+      <w:lvlText w:val="o"/>
+      <w:lvlJc w:val="left"/>
+      <w:pPr>
+        <w:ind w:left="5760" w:hanging="360"/>
+      </w:pPr>
+      <w:rPr>
+        <w:rFonts w:hint="default" w:ascii="Courier New" w:hAnsi="Courier New"/>
+      </w:rPr>
+    </w:lvl>
+    <w:lvl xmlns:w="http://schemas.openxmlformats.org/wordprocessingml/2006/main" w:ilvl="8">
+      <w:start w:val="1"/>
+      <w:numFmt w:val="bullet"/>
+      <w:lvlText w:val=""/>
+      <w:lvlJc w:val="left"/>
+      <w:pPr>
+        <w:ind w:left="6480" w:hanging="360"/>
+      </w:pPr>
+      <w:rPr>
+        <w:rFonts w:hint="default" w:ascii="Wingdings" w:hAnsi="Wingdings"/>
+      </w:rPr>
+    </w:lvl>
+  </w:abstractNum>
+  <w:abstractNum xmlns:w="http://schemas.openxmlformats.org/wordprocessingml/2006/main" w:abstractNumId="19">
+    <w:nsid w:val="645ef5ae"/>
+    <w:multiLevelType xmlns:w="http://schemas.openxmlformats.org/wordprocessingml/2006/main" w:val="hybridMultilevel"/>
+    <w:lvl xmlns:w="http://schemas.openxmlformats.org/wordprocessingml/2006/main" w:ilvl="0">
+      <w:start w:val="1"/>
+      <w:numFmt w:val="decimal"/>
+      <w:lvlText w:val="%1."/>
+      <w:lvlJc w:val="left"/>
+      <w:pPr>
+        <w:ind w:left="765" w:hanging="360"/>
+      </w:pPr>
+    </w:lvl>
+    <w:lvl xmlns:w="http://schemas.openxmlformats.org/wordprocessingml/2006/main" w:ilvl="1">
+      <w:start w:val="1"/>
+      <w:numFmt w:val="lowerLetter"/>
+      <w:lvlText w:val="%2."/>
+      <w:lvlJc w:val="left"/>
+      <w:pPr>
+        <w:ind w:left="1485" w:hanging="360"/>
+      </w:pPr>
+    </w:lvl>
+    <w:lvl xmlns:w="http://schemas.openxmlformats.org/wordprocessingml/2006/main" w:ilvl="2">
+      <w:start w:val="1"/>
+      <w:numFmt w:val="lowerRoman"/>
+      <w:lvlText w:val="%3."/>
+      <w:lvlJc w:val="right"/>
+      <w:pPr>
+        <w:ind w:left="2205" w:hanging="180"/>
+      </w:pPr>
+    </w:lvl>
+    <w:lvl xmlns:w="http://schemas.openxmlformats.org/wordprocessingml/2006/main" w:ilvl="3">
+      <w:start w:val="1"/>
+      <w:numFmt w:val="decimal"/>
+      <w:lvlText w:val="%4."/>
+      <w:lvlJc w:val="left"/>
+      <w:pPr>
+        <w:ind w:left="2925" w:hanging="360"/>
+      </w:pPr>
+    </w:lvl>
+    <w:lvl xmlns:w="http://schemas.openxmlformats.org/wordprocessingml/2006/main" w:ilvl="4">
+      <w:start w:val="1"/>
+      <w:numFmt w:val="lowerLetter"/>
+      <w:lvlText w:val="%5."/>
+      <w:lvlJc w:val="left"/>
+      <w:pPr>
+        <w:ind w:left="3645" w:hanging="360"/>
+      </w:pPr>
+    </w:lvl>
+    <w:lvl xmlns:w="http://schemas.openxmlformats.org/wordprocessingml/2006/main" w:ilvl="5">
+      <w:start w:val="1"/>
+      <w:numFmt w:val="lowerRoman"/>
+      <w:lvlText w:val="%6."/>
+      <w:lvlJc w:val="right"/>
+      <w:pPr>
+        <w:ind w:left="4365" w:hanging="180"/>
+      </w:pPr>
+    </w:lvl>
+    <w:lvl xmlns:w="http://schemas.openxmlformats.org/wordprocessingml/2006/main" w:ilvl="6">
+      <w:start w:val="1"/>
+      <w:numFmt w:val="decimal"/>
+      <w:lvlText w:val="%7."/>
+      <w:lvlJc w:val="left"/>
+      <w:pPr>
+        <w:ind w:left="5085" w:hanging="360"/>
+      </w:pPr>
+    </w:lvl>
+    <w:lvl xmlns:w="http://schemas.openxmlformats.org/wordprocessingml/2006/main" w:ilvl="7">
+      <w:start w:val="1"/>
+      <w:numFmt w:val="lowerLetter"/>
+      <w:lvlText w:val="%8."/>
+      <w:lvlJc w:val="left"/>
+      <w:pPr>
+        <w:ind w:left="5805" w:hanging="360"/>
+      </w:pPr>
+    </w:lvl>
+    <w:lvl xmlns:w="http://schemas.openxmlformats.org/wordprocessingml/2006/main" w:ilvl="8">
+      <w:start w:val="1"/>
+      <w:numFmt w:val="lowerRoman"/>
+      <w:lvlText w:val="%9."/>
+      <w:lvlJc w:val="right"/>
+      <w:pPr>
+        <w:ind w:left="6525" w:hanging="180"/>
+      </w:pPr>
+    </w:lvl>
+  </w:abstractNum>
   <w:abstractNum w:abstractNumId="0" w15:restartNumberingAfterBreak="0">
     <w:nsid w:val="018A3637"/>
     <w:multiLevelType w:val="hybridMultilevel"/>
@@ -3873,7 +4541,7 @@
         <w:ind w:left="405" w:hanging="405"/>
       </w:pPr>
       <w:rPr>
-        <w:rFonts w:ascii="Arial" w:hAnsi="Arial" w:cs="Arial" w:eastAsiaTheme="minorHAnsi"/>
+        <w:rFonts w:hint="default" w:ascii="Arial" w:hAnsi="Arial"/>
       </w:rPr>
     </w:lvl>
     <w:lvl w:ilvl="1">
@@ -4516,6 +5184,21 @@
       </w:rPr>
     </w:lvl>
   </w:abstractNum>
+  <w:num w:numId="29">
+    <w:abstractNumId w:val="23"/>
+  </w:num>
+  <w:num w:numId="28">
+    <w:abstractNumId w:val="22"/>
+  </w:num>
+  <w:num w:numId="27">
+    <w:abstractNumId w:val="21"/>
+  </w:num>
+  <w:num w:numId="26">
+    <w:abstractNumId w:val="20"/>
+  </w:num>
+  <w:num w:numId="25">
+    <w:abstractNumId w:val="19"/>
+  </w:num>
   <w:num w:numId="1" w16cid:durableId="2069646591">
     <w:abstractNumId w:val="0"/>
   </w:num>

</xml_diff>